<commit_message>
Give the thesis statement its own heading
The thesis was the third sentence of the opening paragraph of 1.1, with
nothing to mark it. Unit One covered thesis statement development
explicitly, so a marker looking for one had to find it buried in prose.

Section 1.1 is now split in the manner of the worked exemplar, which
separates its introduction from its background:

  1.1   Introduction and Background
  1.1.1 Thesis Statement
  1.1.2 Background of the Study

The opening paragraph keeps the two framing sentences and now ends by
pointing at what follows. The thesis stands alone under its own heading,
unchanged in wording. The twelve background paragraphs sit under 1.1.2.

The brief's own numbering from 1.1 to 1.6 is untouched; the two new
headings are subdivisions within 1.1, matching the existing 1.3.1.

Co-Authored-By: Claude Opus 5 <noreply@anthropic.com>
Claude-Session: https://claude.ai/code/session_012fRxBUhhiQNwg1XV3dBASw
</commit_message>
<xml_diff>
--- a/proposal/Karabo_Ojiambo_Unit_Two_Assignment.docx
+++ b/proposal/Karabo_Ojiambo_Unit_Two_Assignment.docx
@@ -205,7 +205,60 @@
           <w:sz w:val="24"/>
           <w:szCs w:val="24"/>
         </w:rPr>
-        <w:t xml:space="preserve">The use of digital technology to support teaching, learning, and assessment has expanded rapidly across education systems worldwide. In low-resource settings, however, the tools that reach classrooms are seldom designed for the conditions those classrooms actually face. This study examines how an offline-first web application can use children’s drawings and spoken narratives—forms of expression that require neither literacy nor an internet connection—to support developmental screening and structured creative skills progression among vulnerable children aged 8 to 18 in community and faith-based schools in Kampala, Uganda. The section that follows provides the background to this investigation.</w:t>
+        <w:t xml:space="preserve">The use of digital technology to support teaching, learning, and assessment has expanded rapidly across education systems worldwide. In low-resource settings, however, the tools that reach classrooms are seldom designed for the conditions those classrooms actually face. This study addresses that mismatch for a specific population in a specific setting.</w:t>
+      </w:r>
+    </w:p>
+    <w:p>
+      <w:pPr>
+        <w:pStyle w:val="Heading3"/>
+        <w:spacing w:after="0" w:before="0" w:line="480"/>
+        <w:jc w:val="left"/>
+      </w:pPr>
+      <w:r>
+        <w:rPr>
+          <w:rFonts w:ascii="Arial" w:cs="Arial" w:eastAsia="Arial" w:hAnsi="Arial"/>
+          <w:b/>
+          <w:bCs/>
+          <w:i/>
+          <w:iCs/>
+          <w:sz w:val="24"/>
+          <w:szCs w:val="24"/>
+        </w:rPr>
+        <w:t xml:space="preserve">1.1.1 Thesis Statement</w:t>
+      </w:r>
+    </w:p>
+    <w:p>
+      <w:pPr>
+        <w:spacing w:after="0" w:before="0" w:line="480"/>
+        <w:ind w:firstLine="720"/>
+        <w:jc w:val="left"/>
+      </w:pPr>
+      <w:r>
+        <w:rPr>
+          <w:rFonts w:ascii="Times New Roman" w:cs="Times New Roman" w:eastAsia="Times New Roman" w:hAnsi="Times New Roman"/>
+          <w:sz w:val="24"/>
+          <w:szCs w:val="24"/>
+        </w:rPr>
+        <w:t xml:space="preserve">This study examines how an offline-first web application can use children’s drawings and spoken narratives—forms of expression that require neither literacy nor an internet connection—to support developmental screening and structured creative skills progression among vulnerable children aged 8 to 18 in community and faith-based schools in Kampala, Uganda.</w:t>
+      </w:r>
+    </w:p>
+    <w:p>
+      <w:pPr>
+        <w:pStyle w:val="Heading3"/>
+        <w:spacing w:after="0" w:before="0" w:line="480"/>
+        <w:jc w:val="left"/>
+      </w:pPr>
+      <w:r>
+        <w:rPr>
+          <w:rFonts w:ascii="Arial" w:cs="Arial" w:eastAsia="Arial" w:hAnsi="Arial"/>
+          <w:b/>
+          <w:bCs/>
+          <w:i/>
+          <w:iCs/>
+          <w:sz w:val="24"/>
+          <w:szCs w:val="24"/>
+        </w:rPr>
+        <w:t xml:space="preserve">1.1.2 Background of the Study</w:t>
       </w:r>
     </w:p>
     <w:p>

</xml_diff>